<commit_message>
WI-017: Concepts Guide: filled contents list, figure alt text, on-screen labels in Find it lines
Co-Authored-By: Claude Sonnet 5.5 <noreply@anthropic.com>
Claude-Session: https://claude.ai/code/session_017LVj4XvkSgK1Sz6KUX1ZbY
</commit_message>
<xml_diff>
--- a/documentation/reference/Retirement_Planner_Concepts_Guide.docx
+++ b/documentation/reference/Retirement_Planner_Concepts_Guide.docx
@@ -96,7 +96,7 @@
         <w:drawing>
           <wp:inline xmlns:a="http://schemas.openxmlformats.org/drawingml/2006/main" xmlns:pic="http://schemas.openxmlformats.org/drawingml/2006/picture">
             <wp:extent cx="5669280" cy="2644013"/>
-            <wp:docPr id="1" name="Picture 1"/>
+            <wp:docPr id="1" name="Picture 1" descr="Flow diagram titled The retirement money cycle. Income (pay, Social Security, pensions, annuities) flows to Accounts (pre-tax, taxable, Roth, HSA, cash). Accounts flow to Spending (living, health, housing, gifts) and to Taxes (federal, state, Medicare surcharge). Taxes flow to Legacy (heirs, charity, after estate tax). Risk (inflation, markets, long life) feeds into Taxes."/>
             <wp:cNvGraphicFramePr>
               <a:graphicFrameLocks noChangeAspect="1"/>
             </wp:cNvGraphicFramePr>
@@ -184,6 +184,282 @@
       <w:r>
         <w:fldChar w:fldCharType="separate"/>
       </w:r>
+    </w:p>
+    <w:p>
+      <w:pPr>
+        <w:spacing w:after="40"/>
+      </w:pPr>
+      <w:r>
+        <w:rPr>
+          <w:b/>
+        </w:rPr>
+        <w:t>How to use this guide</w:t>
+      </w:r>
+    </w:p>
+    <w:p>
+      <w:pPr>
+        <w:spacing w:after="40"/>
+      </w:pPr>
+      <w:r>
+        <w:rPr>
+          <w:b/>
+        </w:rPr>
+        <w:t>Part 1. The big picture</w:t>
+      </w:r>
+    </w:p>
+    <w:p>
+      <w:pPr>
+        <w:spacing w:after="40"/>
+        <w:ind w:left="360"/>
+      </w:pPr>
+      <w:r>
+        <w:rPr/>
+        <w:t>What a retirement plan actually answers</w:t>
+      </w:r>
+    </w:p>
+    <w:p>
+      <w:pPr>
+        <w:spacing w:after="40"/>
+        <w:ind w:left="360"/>
+      </w:pPr>
+      <w:r>
+        <w:rPr/>
+        <w:t>The three buckets</w:t>
+      </w:r>
+    </w:p>
+    <w:p>
+      <w:pPr>
+        <w:spacing w:after="40"/>
+        <w:ind w:left="360"/>
+      </w:pPr>
+      <w:r>
+        <w:rPr/>
+        <w:t>The ages that matter</w:t>
+      </w:r>
+    </w:p>
+    <w:p>
+      <w:pPr>
+        <w:spacing w:after="40"/>
+        <w:ind w:left="360"/>
+      </w:pPr>
+      <w:r>
+        <w:rPr/>
+        <w:t>How the planner runs each year</w:t>
+      </w:r>
+    </w:p>
+    <w:p>
+      <w:pPr>
+        <w:spacing w:after="40"/>
+        <w:ind w:left="360"/>
+      </w:pPr>
+      <w:r>
+        <w:rPr/>
+        <w:t>Tax brackets in one picture</w:t>
+      </w:r>
+    </w:p>
+    <w:p>
+      <w:pPr>
+        <w:spacing w:after="40"/>
+        <w:ind w:left="360"/>
+      </w:pPr>
+      <w:r>
+        <w:rPr/>
+        <w:t>Social Security timing</w:t>
+      </w:r>
+    </w:p>
+    <w:p>
+      <w:pPr>
+        <w:spacing w:after="40"/>
+        <w:ind w:left="360"/>
+      </w:pPr>
+      <w:r>
+        <w:rPr/>
+        <w:t>Probability, not prediction</w:t>
+      </w:r>
+    </w:p>
+    <w:p>
+      <w:pPr>
+        <w:spacing w:after="40"/>
+        <w:ind w:left="360"/>
+      </w:pPr>
+      <w:r>
+        <w:rPr/>
+        <w:t>Scoring a plan</w:t>
+      </w:r>
+    </w:p>
+    <w:p>
+      <w:pPr>
+        <w:spacing w:after="40"/>
+        <w:ind w:left="360"/>
+      </w:pPr>
+      <w:r>
+        <w:rPr/>
+        <w:t>Five rules of thumb the planner makes visible</w:t>
+      </w:r>
+    </w:p>
+    <w:p>
+      <w:pPr>
+        <w:spacing w:after="40"/>
+      </w:pPr>
+      <w:r>
+        <w:rPr>
+          <w:b/>
+        </w:rPr>
+        <w:t>Part 2. Concepts, settings and results</w:t>
+      </w:r>
+    </w:p>
+    <w:p>
+      <w:pPr>
+        <w:spacing w:after="40"/>
+        <w:ind w:left="360"/>
+      </w:pPr>
+      <w:r>
+        <w:rPr/>
+        <w:t>1. Household &amp; Timeline</w:t>
+      </w:r>
+    </w:p>
+    <w:p>
+      <w:pPr>
+        <w:spacing w:after="40"/>
+        <w:ind w:left="360"/>
+      </w:pPr>
+      <w:r>
+        <w:rPr/>
+        <w:t>2. Economy &amp; Assumptions</w:t>
+      </w:r>
+    </w:p>
+    <w:p>
+      <w:pPr>
+        <w:spacing w:after="40"/>
+        <w:ind w:left="360"/>
+      </w:pPr>
+      <w:r>
+        <w:rPr/>
+        <w:t>3. Income</w:t>
+      </w:r>
+    </w:p>
+    <w:p>
+      <w:pPr>
+        <w:spacing w:after="40"/>
+        <w:ind w:left="360"/>
+      </w:pPr>
+      <w:r>
+        <w:rPr/>
+        <w:t>4. Spending &amp; Healthcare</w:t>
+      </w:r>
+    </w:p>
+    <w:p>
+      <w:pPr>
+        <w:spacing w:after="40"/>
+        <w:ind w:left="360"/>
+      </w:pPr>
+      <w:r>
+        <w:rPr/>
+        <w:t>5. Housing &amp; Real Estate</w:t>
+      </w:r>
+    </w:p>
+    <w:p>
+      <w:pPr>
+        <w:spacing w:after="40"/>
+        <w:ind w:left="360"/>
+      </w:pPr>
+      <w:r>
+        <w:rPr/>
+        <w:t>6. Accounts, Holdings &amp; Allocation</w:t>
+      </w:r>
+    </w:p>
+    <w:p>
+      <w:pPr>
+        <w:spacing w:after="40"/>
+        <w:ind w:left="360"/>
+      </w:pPr>
+      <w:r>
+        <w:rPr/>
+        <w:t>7. Withdrawals &amp; Cash Flow</w:t>
+      </w:r>
+    </w:p>
+    <w:p>
+      <w:pPr>
+        <w:spacing w:after="40"/>
+        <w:ind w:left="360"/>
+      </w:pPr>
+      <w:r>
+        <w:rPr/>
+        <w:t>8. Taxes</w:t>
+      </w:r>
+    </w:p>
+    <w:p>
+      <w:pPr>
+        <w:spacing w:after="40"/>
+        <w:ind w:left="360"/>
+      </w:pPr>
+      <w:r>
+        <w:rPr/>
+        <w:t>9. RMDs &amp; Roth Conversions</w:t>
+      </w:r>
+    </w:p>
+    <w:p>
+      <w:pPr>
+        <w:spacing w:after="40"/>
+        <w:ind w:left="360"/>
+      </w:pPr>
+      <w:r>
+        <w:rPr/>
+        <w:t>10. Charitable Giving</w:t>
+      </w:r>
+    </w:p>
+    <w:p>
+      <w:pPr>
+        <w:spacing w:after="40"/>
+        <w:ind w:left="360"/>
+      </w:pPr>
+      <w:r>
+        <w:rPr/>
+        <w:t>11. Insurance, Care &amp; Special Situations</w:t>
+      </w:r>
+    </w:p>
+    <w:p>
+      <w:pPr>
+        <w:spacing w:after="40"/>
+        <w:ind w:left="360"/>
+      </w:pPr>
+      <w:r>
+        <w:rPr/>
+        <w:t>12. Estate &amp; Legacy</w:t>
+      </w:r>
+    </w:p>
+    <w:p>
+      <w:pPr>
+        <w:spacing w:after="40"/>
+        <w:ind w:left="360"/>
+      </w:pPr>
+      <w:r>
+        <w:rPr/>
+        <w:t>13. Risk, Stress Tests &amp; Probability</w:t>
+      </w:r>
+    </w:p>
+    <w:p>
+      <w:pPr>
+        <w:spacing w:after="40"/>
+        <w:ind w:left="360"/>
+      </w:pPr>
+      <w:r>
+        <w:rPr/>
+        <w:t>14. Decision Scores &amp; Scenarios</w:t>
+      </w:r>
+    </w:p>
+    <w:p>
+      <w:pPr>
+        <w:spacing w:after="40"/>
+      </w:pPr>
+      <w:r>
+        <w:rPr>
+          <w:b/>
+        </w:rPr>
+        <w:t>Appendix. Acronym and term index</w:t>
+      </w:r>
+    </w:p>
+    <w:p>
       <w:r>
         <w:fldChar w:fldCharType="end"/>
       </w:r>
@@ -196,7 +472,7 @@
           <w:color w:val="6B7280"/>
           <w:sz w:val="18"/>
         </w:rPr>
-        <w:t>(If the list above is empty, right-click it in Word and choose Update Field.)</w:t>
+        <w:t>(To add page numbers, right-click the list in Word and choose Update Field.)</w:t>
       </w:r>
     </w:p>
     <w:p>
@@ -274,7 +550,7 @@
           </w:p>
           <w:p>
             <w:r>
-              <w:t>Find it: the screen and field name in the app.</w:t>
+              <w:t>Find it: the screen and the label shown beside the field in the app. [Name] stands for a household member's first name, and “the Survivor fields” means every field whose label begins with Survivor.</w:t>
             </w:r>
           </w:p>
         </w:tc>
@@ -489,7 +765,7 @@
         <w:drawing>
           <wp:inline xmlns:a="http://schemas.openxmlformats.org/drawingml/2006/main" xmlns:pic="http://schemas.openxmlformats.org/drawingml/2006/picture">
             <wp:extent cx="5943600" cy="2256141"/>
-            <wp:docPr id="2" name="Picture 2"/>
+            <wp:docPr id="2" name="Picture 2" descr="Three boxes side by side. Pre-tax (401(k), IRA): taxed as ordinary income when withdrawn and forced out by required minimum distributions. Taxable (brokerage, cash): tax only on gains, lower long-term rates, basis stepped up at death. Roth (Roth IRA, 401(k)): withdrawals tax-free, no required minimum distributions, best asset to leave heirs. A note says a Roth conversion moves dollars from the pre-tax bucket to the Roth bucket and pays the tax now at a rate you pick."/>
             <wp:cNvGraphicFramePr>
               <a:graphicFrameLocks noChangeAspect="1"/>
             </wp:cNvGraphicFramePr>
@@ -561,7 +837,7 @@
         <w:drawing>
           <wp:inline xmlns:a="http://schemas.openxmlformats.org/drawingml/2006/main" xmlns:pic="http://schemas.openxmlformats.org/drawingml/2006/picture">
             <wp:extent cx="5943600" cy="2359958"/>
-            <wp:docPr id="3" name="Picture 3"/>
+            <wp:docPr id="3" name="Picture 3" descr="Timeline of the ages that drive a retirement plan: 59 and a half, penalty-free IRA withdrawals; 62, earliest Social Security; about 67, full retirement age; 65, Medicare starts; 70, maximum Social Security; 73 to 75, required minimum distributions begin; 85, latest start for a qualified longevity annuity contract. A shaded band marks the typical Roth-conversion window, from the early sixties until required distributions begin."/>
             <wp:cNvGraphicFramePr>
               <a:graphicFrameLocks noChangeAspect="1"/>
             </wp:cNvGraphicFramePr>
@@ -815,7 +1091,7 @@
         <w:drawing>
           <wp:inline xmlns:a="http://schemas.openxmlformats.org/drawingml/2006/main" xmlns:pic="http://schemas.openxmlformats.org/drawingml/2006/picture">
             <wp:extent cx="5943600" cy="2908137"/>
-            <wp:docPr id="4" name="Picture 4"/>
+            <wp:docPr id="4" name="Picture 4" descr="Bar chart of illustrative federal tax brackets for married filing jointly, rate against taxable income in thousands of dollars. Rates step up as income rises: 10, 12, 22, 24, 32, 35 and 37 percent. An arrow points to the 24 percent step with the note that filling the 24 percent bracket means converting until that step is full."/>
             <wp:cNvGraphicFramePr>
               <a:graphicFrameLocks noChangeAspect="1"/>
             </wp:cNvGraphicFramePr>
@@ -878,7 +1154,7 @@
         <w:drawing>
           <wp:inline xmlns:a="http://schemas.openxmlformats.org/drawingml/2006/main" xmlns:pic="http://schemas.openxmlformats.org/drawingml/2006/picture">
             <wp:extent cx="5943600" cy="2740492"/>
-            <wp:docPr id="5" name="Picture 5"/>
+            <wp:docPr id="5" name="Picture 5" descr="Bar chart of Social Security benefit as a percent of the full benefit by the age you start, assuming full retirement age 67. Starting at 62 gives 70 percent, 63 gives 75, 64 gives 80, 65 gives 87, 66 gives 93, 67 gives 100, 68 gives 108, 69 gives 116 and 70 gives 124 percent. Waiting raises every future check."/>
             <wp:cNvGraphicFramePr>
               <a:graphicFrameLocks noChangeAspect="1"/>
             </wp:cNvGraphicFramePr>
@@ -950,7 +1226,7 @@
         <w:drawing>
           <wp:inline xmlns:a="http://schemas.openxmlformats.org/drawingml/2006/main" xmlns:pic="http://schemas.openxmlformats.org/drawingml/2006/picture">
             <wp:extent cx="5943600" cy="3080147"/>
-            <wp:docPr id="6" name="Picture 6"/>
+            <wp:docPr id="6" name="Picture 6" descr="Fan chart of Monte Carlo results: portfolio as a multiple of its starting value over 30 years of retirement. A line shows the median path, staying near 1 times the start. Shaded bands widen over time to show the range of outcomes, from near zero to over 5 times the start. A red line at zero marks running out of money; the success rate is the share of futures that never reach it."/>
             <wp:cNvGraphicFramePr>
               <a:graphicFrameLocks noChangeAspect="1"/>
             </wp:cNvGraphicFramePr>
@@ -1022,7 +1298,7 @@
         <w:drawing>
           <wp:inline xmlns:a="http://schemas.openxmlformats.org/drawingml/2006/main" xmlns:pic="http://schemas.openxmlformats.org/drawingml/2006/picture">
             <wp:extent cx="5943600" cy="2185147"/>
-            <wp:docPr id="7" name="Picture 7"/>
+            <wp:docPr id="7" name="Picture 7" descr="Equation diagram: Lifetime spending (what you enjoy) plus Legacy after all taxes (what heirs keep) equals the LCV score. A note says taxes, healthcare and estate costs shrink both boxes, so tax strategies raise the score."/>
             <wp:cNvGraphicFramePr>
               <a:graphicFrameLocks noChangeAspect="1"/>
             </wp:cNvGraphicFramePr>
@@ -1273,7 +1549,7 @@
         <w:rPr>
           <w:sz w:val="18"/>
         </w:rPr>
-        <w:t>Household &amp; People | member_1_*, member_2_*</w:t>
+        <w:t>Household &amp; People | [Name 1] and [Name 2] fields</w:t>
       </w:r>
     </w:p>
     <w:p>
@@ -1339,7 +1615,7 @@
         <w:rPr>
           <w:sz w:val="18"/>
         </w:rPr>
-        <w:t>Household &amp; People | member_N_dob</w:t>
+        <w:t>Household &amp; People | [Name] DOB</w:t>
       </w:r>
     </w:p>
     <w:p>
@@ -1405,7 +1681,7 @@
         <w:rPr>
           <w:sz w:val="18"/>
         </w:rPr>
-        <w:t>Household &amp; People | member_N_retirement_date</w:t>
+        <w:t>Household &amp; People | [Name] Retirement Date</w:t>
       </w:r>
     </w:p>
     <w:p>
@@ -1471,7 +1747,7 @@
         <w:rPr>
           <w:sz w:val="18"/>
         </w:rPr>
-        <w:t>Household &amp; People | member_N_mortality_age</w:t>
+        <w:t>Household &amp; People | [Name] Mortality Age</w:t>
       </w:r>
     </w:p>
     <w:p>
@@ -1537,7 +1813,7 @@
         <w:rPr>
           <w:sz w:val="18"/>
         </w:rPr>
-        <w:t>Household &amp; People | residence_state; State Comparison</w:t>
+        <w:t>Household &amp; People | Residence State; State Comparison</w:t>
       </w:r>
     </w:p>
     <w:p>
@@ -1603,7 +1879,7 @@
         <w:rPr>
           <w:sz w:val="18"/>
         </w:rPr>
-        <w:t>Household &amp; People | filing_status, survivor_filing_status, survivor_has_dependent</w:t>
+        <w:t>Household &amp; People | Filing Status, Survivor Filing Status, Survivor Has Dependent</w:t>
       </w:r>
     </w:p>
     <w:p>
@@ -1669,7 +1945,7 @@
         <w:rPr>
           <w:sz w:val="18"/>
         </w:rPr>
-        <w:t>Household &amp; People; Stress Test &gt; Survivor | survivor_*</w:t>
+        <w:t>Household &amp; People; Stress Test &gt; Survivor | the Survivor fields</w:t>
       </w:r>
     </w:p>
     <w:p>
@@ -1772,7 +2048,7 @@
         <w:rPr>
           <w:sz w:val="18"/>
         </w:rPr>
-        <w:t>Economic &amp; Tax Assumptions | inflation_general</w:t>
+        <w:t>Economic &amp; Tax Assumptions | General CPI Inflation</w:t>
       </w:r>
     </w:p>
     <w:p>
@@ -1838,7 +2114,7 @@
         <w:rPr>
           <w:sz w:val="18"/>
         </w:rPr>
-        <w:t>Economic &amp; Tax Assumptions | portfolio_nominal_return</w:t>
+        <w:t>Economic &amp; Tax Assumptions | Portfolio Nominal Return</w:t>
       </w:r>
     </w:p>
     <w:p>
@@ -1904,7 +2180,7 @@
         <w:rPr>
           <w:sz w:val="18"/>
         </w:rPr>
-        <w:t>Economic &amp; Tax Assumptions | social_security_cola</w:t>
+        <w:t>Economic &amp; Tax Assumptions | Social Security COLA</w:t>
       </w:r>
     </w:p>
     <w:p>
@@ -1970,7 +2246,7 @@
         <w:rPr>
           <w:sz w:val="18"/>
         </w:rPr>
-        <w:t>Economic &amp; Tax Assumptions | medicare_part_b_inflation, medicare_part_d_inflation</w:t>
+        <w:t>Economic &amp; Tax Assumptions | Medicare Part B Inflation, Medicare Part D Inflation</w:t>
       </w:r>
     </w:p>
     <w:p>
@@ -2036,7 +2312,7 @@
         <w:rPr>
           <w:sz w:val="18"/>
         </w:rPr>
-        <w:t>Economic &amp; Tax Assumptions | fed_tax_bracket_inflator</w:t>
+        <w:t>Economic &amp; Tax Assumptions | Fed Tax Bracket Inflator</w:t>
       </w:r>
     </w:p>
     <w:p>
@@ -2102,7 +2378,7 @@
         <w:rPr>
           <w:sz w:val="18"/>
         </w:rPr>
-        <w:t>Economic &amp; Tax Assumptions | social_security_taxable_fraction</w:t>
+        <w:t>Economic &amp; Tax Assumptions | Social Security Taxable Fraction</w:t>
       </w:r>
     </w:p>
     <w:p>
@@ -2168,7 +2444,7 @@
         <w:rPr>
           <w:sz w:val="18"/>
         </w:rPr>
-        <w:t>Economic &amp; Tax Assumptions | cash_yield_rate</w:t>
+        <w:t>Economic &amp; Tax Assumptions | Cash Yield Rate</w:t>
       </w:r>
     </w:p>
     <w:p>
@@ -2234,7 +2510,7 @@
         <w:rPr>
           <w:sz w:val="18"/>
         </w:rPr>
-        <w:t>Settings / Reporting | real_dollar_reporting_enabled</w:t>
+        <w:t>Settings / Reporting | Real Dollar Reporting Enabled</w:t>
       </w:r>
     </w:p>
     <w:p>
@@ -2300,7 +2576,7 @@
         <w:rPr>
           <w:sz w:val="18"/>
         </w:rPr>
-        <w:t>Economic &amp; Tax Assumptions | annuity_default_dividend_rate, annuity_default_additional_income_pct</w:t>
+        <w:t>Economic &amp; Tax Assumptions | Annuity Default Dividend Rate, Annuity Default Additional Income</w:t>
       </w:r>
     </w:p>
     <w:p>
@@ -2403,7 +2679,7 @@
         <w:rPr>
           <w:sz w:val="18"/>
         </w:rPr>
-        <w:t>Work Income | annual_earned_income, earned_income_start_year, earned_income_last_year, earned_income_annual_increase</w:t>
+        <w:t>Work Income | Annual Earned Income, Earned Income Start Year, Earned Income Last Year, Earned Income Annual Increase</w:t>
       </w:r>
     </w:p>
     <w:p>
@@ -2469,7 +2745,7 @@
         <w:rPr>
           <w:sz w:val="18"/>
         </w:rPr>
-        <w:t>Work Income | entity_type, qbi_eligible, qbi_phaseout_applies, reasonable_salary_annual, business_expenses_annual</w:t>
+        <w:t>Work Income | Entity Type, QBI Eligible, QBI Phaseout Applies, Reasonable Salary Annual, Business Expenses Annual</w:t>
       </w:r>
     </w:p>
     <w:p>
@@ -2535,7 +2811,7 @@
         <w:rPr>
           <w:sz w:val="18"/>
         </w:rPr>
-        <w:t>Work Income | health_insurance_premiums_annual, sehi_added_to_w2</w:t>
+        <w:t>Work Income | Health Insurance Premiums Annual, SEHI Added To W-2</w:t>
       </w:r>
     </w:p>
     <w:p>
@@ -2601,7 +2877,7 @@
         <w:rPr>
           <w:sz w:val="18"/>
         </w:rPr>
-        <w:t>Work Income | monthly_401k_contribution, annual_401k_limit_base_year, index_401k_limit</w:t>
+        <w:t>Work Income | Monthly 401(k) Contribution, Annual 401(k) Limit Base Year, Index 401(k) Limit</w:t>
       </w:r>
     </w:p>
     <w:p>
@@ -2667,7 +2943,7 @@
         <w:rPr>
           <w:sz w:val="18"/>
         </w:rPr>
-        <w:t>Economic &amp; Tax Assumptions | ss_employee_rate, medicare_employee_rate, ss_wage_base_base_year, additional_medicare_rate, se_net_earnings_factor</w:t>
+        <w:t>Economic &amp; Tax Assumptions | SS Employee Rate, Medicare Employee Rate, SS Wage Base Base Year, Additional Medicare Rate, SE Net Earnings Factor</w:t>
       </w:r>
     </w:p>
     <w:p>
@@ -2733,7 +3009,7 @@
         <w:rPr>
           <w:sz w:val="18"/>
         </w:rPr>
-        <w:t>SS, Pensions &amp; Annuities | claim_age, fra_age</w:t>
+        <w:t>SS, Pensions &amp; Annuities | Claim Age, FRA Age</w:t>
       </w:r>
     </w:p>
     <w:p>
@@ -2799,7 +3075,7 @@
         <w:rPr>
           <w:sz w:val="18"/>
         </w:rPr>
-        <w:t>SS, Pensions &amp; Annuities | monthly_pia_at_fra_today_dollars, ss_benefit_age_62..70</w:t>
+        <w:t>SS, Pensions &amp; Annuities | Monthly at FRA, Benefit at 62 through Benefit at 70</w:t>
       </w:r>
     </w:p>
     <w:p>
@@ -2865,7 +3141,7 @@
         <w:rPr>
           <w:sz w:val="18"/>
         </w:rPr>
-        <w:t>SS, Pensions &amp; Annuities | spousal_benefits_enabled, survivor_pct_of_higher_benefit, survivor_benefit_uses_deceased_claim_age</w:t>
+        <w:t>SS, Pensions &amp; Annuities | Spousal Benefits Enabled, Survivor % of Higher Benefit, Survivor Benefit Uses Deceased Claim Age</w:t>
       </w:r>
     </w:p>
     <w:p>
@@ -2931,7 +3207,7 @@
         <w:rPr>
           <w:sz w:val="18"/>
         </w:rPr>
-        <w:t>SS, Pensions &amp; Annuities | ss_funding_discount_year, ss_funding_discount_pct</w:t>
+        <w:t>SS, Pensions &amp; Annuities | Discount Starts, Benefit Reduction</w:t>
       </w:r>
     </w:p>
     <w:p>
@@ -2997,7 +3273,7 @@
         <w:rPr>
           <w:sz w:val="18"/>
         </w:rPr>
-        <w:t>SS, Pensions &amp; Annuities; Insurance | first_payment, payout_type, qualified, js_pct, cumulative_at_death</w:t>
+        <w:t>SS, Pensions &amp; Annuities; Insurance | First Payment, Payout Type, Qualified, Joint-and-Survivor Percentage, Cumulative At Death</w:t>
       </w:r>
     </w:p>
     <w:p>
@@ -3063,7 +3339,7 @@
         <w:rPr>
           <w:sz w:val="18"/>
         </w:rPr>
-        <w:t>Insurance | reserve_factor, exclusion_ratio, deferral_dampening, principal_recovery_age</w:t>
+        <w:t>Insurance | Reserve Factor, Exclusion Ratio, Deferral Dampening, Principal Recovery Age</w:t>
       </w:r>
     </w:p>
     <w:p>
@@ -3129,7 +3405,7 @@
         <w:rPr>
           <w:sz w:val="18"/>
         </w:rPr>
-        <w:t>Insurance | dividend_rate, additional_income_pct, deferral_years, pay_in_cash_pct</w:t>
+        <w:t>Insurance | Dividend Rate, Additional Income, Deferral Years, Pay In Cash</w:t>
       </w:r>
     </w:p>
     <w:p>
@@ -3195,7 +3471,7 @@
         <w:rPr>
           <w:sz w:val="18"/>
         </w:rPr>
-        <w:t>Other Assets and Liabilities | face_value, first_payment, last_payment</w:t>
+        <w:t>Other Assets and Liabilities | Face Value, First Payment, Last Payment</w:t>
       </w:r>
     </w:p>
     <w:p>
@@ -3298,7 +3574,7 @@
         <w:rPr>
           <w:sz w:val="18"/>
         </w:rPr>
-        <w:t>Spending Model | annual_spending_base_year, core_spending_growth_mode, core_spending_manual_growth_rate</w:t>
+        <w:t>Spending Model | Core Spending Base, Core Spending Increase Method, Manual Core Spending Increase</w:t>
       </w:r>
     </w:p>
     <w:p>
@@ -3364,7 +3640,7 @@
         <w:rPr>
           <w:sz w:val="18"/>
         </w:rPr>
-        <w:t>Scenarios | spend_multiplier</w:t>
+        <w:t>Scenarios | Spend Multiplier</w:t>
       </w:r>
     </w:p>
     <w:p>
@@ -3430,7 +3706,7 @@
         <w:rPr>
           <w:sz w:val="18"/>
         </w:rPr>
-        <w:t>Spending Model | spending_freeze_year</w:t>
+        <w:t>Spending Model | Core Spending Increase Stops</w:t>
       </w:r>
     </w:p>
     <w:p>
@@ -3496,7 +3772,7 @@
         <w:rPr>
           <w:sz w:val="18"/>
         </w:rPr>
-        <w:t>Spending Model | extra_N_type, extra_N_amount, extra_N_year, extra_N_start_year, extra_N_end_year</w:t>
+        <w:t>Spending Model | Extra Spending Type, Extra Spending Amount, Extra Spending Year, Extra Spending Start Year, Extra Spending End Year</w:t>
       </w:r>
     </w:p>
     <w:p>
@@ -3562,7 +3838,7 @@
         <w:rPr>
           <w:sz w:val="18"/>
         </w:rPr>
-        <w:t>Spending Model &gt; Wellness | annual_premium_base_year, part_b/d/g_base_premium_monthly, annual_oop_estimate_today, oop_utilization_pct, medical_annual, dental_annual, vision_annual, pharmacy_annual</w:t>
+        <w:t>Spending Model &gt; Wellness | Annual Premium Base Year, Monthly Medicare Part B, Part D and Part G, Annual Household Medical OOP Cap, OOP Utilization, Annual Medical Out-of-Pocket, Annual Dental Out-of-Pocket, Annual Vision Out-of-Pocket, Annual Pharmacy Out-of-Pocket</w:t>
       </w:r>
     </w:p>
     <w:p>
@@ -3628,7 +3904,7 @@
         <w:rPr>
           <w:sz w:val="18"/>
         </w:rPr>
-        <w:t>Economic &amp; Tax Assumptions (ACA); Spending Model | household_size, federal_poverty_level_base_year, benchmark_silver_premium_annual, applicable_pct_cap, enhanced_subsidies_through_year</w:t>
+        <w:t>Economic &amp; Tax Assumptions (ACA); Spending Model | Household Size, Federal Poverty Level Base Year, Benchmark Silver Premium Annual, Applicable Cap, Enhanced Subsidies Through Year</w:t>
       </w:r>
     </w:p>
     <w:p>
@@ -3694,7 +3970,7 @@
         <w:rPr>
           <w:sz w:val="18"/>
         </w:rPr>
-        <w:t>Scenarios | cobra_monthly, cobra_end_year</w:t>
+        <w:t>Scenarios | COBRA Monthly, COBRA End Year</w:t>
       </w:r>
     </w:p>
     <w:p>
@@ -3760,7 +4036,7 @@
         <w:rPr>
           <w:sz w:val="18"/>
         </w:rPr>
-        <w:t>Stress Test &gt; Monte Carlo | wellness_cost_shocks, wellness_shock_annual_prob, wellness_shock_mean_cost</w:t>
+        <w:t>Stress Test &gt; Monte Carlo | Wellness Cost Shocks, Wellness Shock Annual Prob, Wellness Shock Mean Cost</w:t>
       </w:r>
     </w:p>
     <w:p>
@@ -3826,7 +4102,7 @@
         <w:rPr>
           <w:sz w:val="18"/>
         </w:rPr>
-        <w:t>Actual Spending | ytd_blend_enabled, ytd_remainder_spending_override</w:t>
+        <w:t>Actual Spending | YTD Blend Enabled, YTD Remainder Spending Override</w:t>
       </w:r>
     </w:p>
     <w:p>
@@ -3929,7 +4205,7 @@
         <w:rPr>
           <w:sz w:val="18"/>
         </w:rPr>
-        <w:t>Other Assets and Liabilities | value_as_of_plan_start, appreciation_rate</w:t>
+        <w:t>Other Assets and Liabilities | Home Value, Appreciation Rate</w:t>
       </w:r>
     </w:p>
     <w:p>
@@ -3995,7 +4271,7 @@
         <w:rPr>
           <w:sz w:val="18"/>
         </w:rPr>
-        <w:t>Spending Model &gt; Housing | monthly_payment, balance_as_of_plan_start, interest_rate, last_payment_date</w:t>
+        <w:t>Spending Model &gt; Housing | Current Monthly Mortgage Payment, Current Loan Amount, Interest Rate, Last Payment Date</w:t>
       </w:r>
     </w:p>
     <w:p>
@@ -4061,7 +4337,7 @@
         <w:rPr>
           <w:sz w:val="18"/>
         </w:rPr>
-        <w:t>Spending Model &gt; Housing | annual_real_estate_taxes, homeowners_insurance_annual, hoa_annual, utilities_annual, home_maintenance_annual</w:t>
+        <w:t>Spending Model &gt; Housing | Annual Real Estate Taxes, Homeowners Insurance Annual, HOA Annual Fee, Utilities Annual, Home Maintenance Annual</w:t>
       </w:r>
     </w:p>
     <w:p>
@@ -4127,7 +4403,7 @@
         <w:rPr>
           <w:sz w:val="18"/>
         </w:rPr>
-        <w:t>Other Assets and Liabilities; Scenarios | home_sale_year, home_sale_price, home_basis, selling_cost_pct, home_sale_proceeds_account, monthly_rent_post_sale</w:t>
+        <w:t>Other Assets and Liabilities; Scenarios | Home Sale Year, Home Sale Price, Home Basis, Commission %, Home Sale Proceeds Account, Monthly Rent Post Sale</w:t>
       </w:r>
     </w:p>
     <w:p>
@@ -4193,7 +4469,7 @@
         <w:rPr>
           <w:sz w:val="18"/>
         </w:rPr>
-        <w:t>Other Assets and Liabilities | section_121_exclusion_mfj</w:t>
+        <w:t>Other Assets and Liabilities | Section 121 Exclusion MFJ</w:t>
       </w:r>
     </w:p>
     <w:p>
@@ -4259,7 +4535,7 @@
         <w:rPr>
           <w:sz w:val="18"/>
         </w:rPr>
-        <w:t>Other Assets and Liabilities; Investment Holdings | home_basis, basis, cost_basis</w:t>
+        <w:t>Other Assets and Liabilities; Investment Holdings | Home Basis, Basis, Cost Basis</w:t>
       </w:r>
     </w:p>
     <w:p>
@@ -4325,7 +4601,7 @@
         <w:rPr>
           <w:sz w:val="18"/>
         </w:rPr>
-        <w:t>Optimize &gt; Next Housing Move | purchase_price, down_payment, mortgage_rate_pct, monthly_rent, re_tax_pct, hoa_pct, start_year, end_year</w:t>
+        <w:t>Optimize &gt; Next Housing Move | Purchase Price, Down Payment, Mortgage Rate, Monthly Rent, RE Tax Rate, HOA Fee %, Start Year, End Year</w:t>
       </w:r>
     </w:p>
     <w:p>
@@ -4391,7 +4667,7 @@
         <w:rPr>
           <w:sz w:val="18"/>
         </w:rPr>
-        <w:t>Rental Properties | value, sale_year, sale_price, basis, depreciation_per_year, depreciation_years, land share</w:t>
+        <w:t>Rental Properties | Value, Sale Year, Sale Price, Basis, Depreciation Per Year, Depreciation Years, Land Share</w:t>
       </w:r>
     </w:p>
     <w:p>
@@ -4457,7 +4733,7 @@
         <w:rPr>
           <w:sz w:val="18"/>
         </w:rPr>
-        <w:t>Home Equity Line | heloc_enabled, heloc_credit_limit, heloc_draw_end_year, heloc_initial_rate_pct, heloc_rate_drift_bps_yr, heloc_repayment_years</w:t>
+        <w:t>Home Equity Line | HELOC Enabled, HELOC Credit Limit, HELOC Draw End Year, HELOC Initial Rate, HELOC Rate Drift bps Yr, HELOC Repayment Years</w:t>
       </w:r>
     </w:p>
     <w:p>
@@ -4626,7 +4902,7 @@
         <w:rPr>
           <w:sz w:val="18"/>
         </w:rPr>
-        <w:t>Investment Holdings | ticker, shares, purchase date, basis</w:t>
+        <w:t>Investment Holdings | Ticker, Shares, Purchase Date, Basis</w:t>
       </w:r>
     </w:p>
     <w:p>
@@ -4758,7 +5034,7 @@
         <w:rPr>
           <w:sz w:val="18"/>
         </w:rPr>
-        <w:t>Reserve Requirements | years_of_expenses, start_year, end_year, reserve_account</w:t>
+        <w:t>Reserve Requirements | Years Of Expenses, Start Year, End Year, Reserve Account</w:t>
       </w:r>
     </w:p>
     <w:p>
@@ -4824,7 +5100,7 @@
         <w:rPr>
           <w:sz w:val="18"/>
         </w:rPr>
-        <w:t>Optimize &gt; Asset Allocation | target_pct, allocation_selection_mode, equity_pct, cash_pct, commodity_pct, risk_tolerance, glide_path</w:t>
+        <w:t>Optimize &gt; Asset Allocation | Target, Allocation Selection Mode, Equity, Cash, Commodity, Risk Tolerance, Glide Path</w:t>
       </w:r>
     </w:p>
     <w:p>
@@ -4890,7 +5166,7 @@
         <w:rPr>
           <w:sz w:val="18"/>
         </w:rPr>
-        <w:t>Optimize &gt; Asset Allocation | holding_period_allocation_enabled, holding_period_floor_strength, real_loss_aware_risk_aversion</w:t>
+        <w:t>Optimize &gt; Asset Allocation | Holding Period Allocation Enabled, Holding Period Floor Strength, Real Loss Aware Risk Aversion</w:t>
       </w:r>
     </w:p>
     <w:p>
@@ -4956,7 +5232,7 @@
         <w:rPr>
           <w:sz w:val="18"/>
         </w:rPr>
-        <w:t>Optimize &gt; Asset Allocation | concentration_employer_stock, concentration_real_estate, concentration_business</w:t>
+        <w:t>Optimize &gt; Asset Allocation | Concentration Employer Stock, Concentration Real Estate, Concentration Business</w:t>
       </w:r>
     </w:p>
     <w:p>
@@ -5022,7 +5298,7 @@
         <w:rPr>
           <w:sz w:val="18"/>
         </w:rPr>
-        <w:t>Optimize &gt; Asset Allocation | capital_market_assumption_preset, _horizon_years</w:t>
+        <w:t>Optimize &gt; Asset Allocation | Capital Market Assumption Preset, Horizon Years</w:t>
       </w:r>
     </w:p>
     <w:p>
@@ -5088,7 +5364,7 @@
         <w:rPr>
           <w:sz w:val="18"/>
         </w:rPr>
-        <w:t>Economic &amp; Tax Assumptions; Account Policy | reinvest_dividends</w:t>
+        <w:t>Economic &amp; Tax Assumptions; Account Policy | Reinvest Dividends</w:t>
       </w:r>
     </w:p>
     <w:p>
@@ -5220,7 +5496,7 @@
         <w:rPr>
           <w:sz w:val="18"/>
         </w:rPr>
-        <w:t>Other Assets and Liabilities | liability balance, payoff date</w:t>
+        <w:t>Other Assets and Liabilities | Liability Balance, Payoff Date</w:t>
       </w:r>
     </w:p>
     <w:p>
@@ -5389,7 +5665,7 @@
         <w:rPr>
           <w:sz w:val="18"/>
         </w:rPr>
-        <w:t>Optimize &gt; Withdrawal Sequencing | RMD, HSA, IRA_elective, Trust, Roth, Home_equity_tap</w:t>
+        <w:t>Optimize &gt; Withdrawal Sequencing | RMD, HSA, IRA (elective), Trust, Roth, Home equity tap</w:t>
       </w:r>
     </w:p>
     <w:p>
@@ -5455,7 +5731,7 @@
         <w:rPr>
           <w:sz w:val="18"/>
         </w:rPr>
-        <w:t>Optimize &gt; Withdrawal Sequencing | annual_funding_tolerance</w:t>
+        <w:t>Optimize &gt; Withdrawal Sequencing | Annual Funding Tolerance</w:t>
       </w:r>
     </w:p>
     <w:p>
@@ -5521,7 +5797,7 @@
         <w:rPr>
           <w:sz w:val="18"/>
         </w:rPr>
-        <w:t>Optimize | source_account, year, amount</w:t>
+        <w:t>Optimize | Source Account, Year, Amount</w:t>
       </w:r>
     </w:p>
     <w:p>
@@ -5587,7 +5863,7 @@
         <w:rPr>
           <w:sz w:val="18"/>
         </w:rPr>
-        <w:t>Optimize &gt; HSA Drawdown | hsa_withdrawal_mode, hsa_annual_spend_pct, hsa_withdrawal_start_year, hsa_withdrawal_end_year, catchup_eligible, requires_hdhp</w:t>
+        <w:t>Optimize &gt; HSA Drawdown | HSA Withdrawal Mode, HSA Annual Spend, HSA Withdrawal Start Year, HSA Withdrawal End Year, Catchup Eligible, Requires HDHP</w:t>
       </w:r>
     </w:p>
     <w:p>
@@ -5653,7 +5929,7 @@
         <w:rPr>
           <w:sz w:val="18"/>
         </w:rPr>
-        <w:t>Optimize &gt; Harvesting | tlh_policy, tlh_min_loss_dollars, tlh_min_loss_pct, tlh_annual_ceiling, tlh_transaction_cost_bps</w:t>
+        <w:t>Optimize &gt; Harvesting | Policy, Minimum Loss ($), Minimum Loss (%), Annual Ceiling, Transaction Cost (bps)</w:t>
       </w:r>
     </w:p>
     <w:p>
@@ -5719,7 +5995,7 @@
         <w:rPr>
           <w:sz w:val="18"/>
         </w:rPr>
-        <w:t>Optimize &gt; Harvesting | ltcg_0pct_top_mfj_base_year, ltcg_15pct_top_mfj_base_year</w:t>
+        <w:t>Optimize &gt; Harvesting | 0% LTCG Bracket Top (MFJ), 15% LTCG Bracket Top (MFJ)</w:t>
       </w:r>
     </w:p>
     <w:p>
@@ -6020,7 +6296,7 @@
         <w:rPr>
           <w:sz w:val="18"/>
         </w:rPr>
-        <w:t>Build &amp; Results | senior_bonus_deduction</w:t>
+        <w:t>Build &amp; Results | Senior Bonus Deduction</w:t>
       </w:r>
     </w:p>
     <w:p>
@@ -6086,7 +6362,7 @@
         <w:rPr>
           <w:sz w:val="18"/>
         </w:rPr>
-        <w:t>Build &amp; Results | salt_gross, property_tax_for_salt</w:t>
+        <w:t>Build &amp; Results | SALT Gross, Property Tax for SALT</w:t>
       </w:r>
     </w:p>
     <w:p>
@@ -6350,7 +6626,7 @@
         <w:rPr>
           <w:sz w:val="18"/>
         </w:rPr>
-        <w:t>Model Constants | niit_magi_threshold_mfj</w:t>
+        <w:t>Model Constants | NIIT MAGI Threshold MFJ</w:t>
       </w:r>
     </w:p>
     <w:p>
@@ -6416,7 +6692,7 @@
         <w:rPr>
           <w:sz w:val="18"/>
         </w:rPr>
-        <w:t>Roth Conversion | irmaa_guardrail_mode, roth_irmaa_cap, roth_irmaa_target_tier</w:t>
+        <w:t>Roth Conversion | IRMAA Guardrail Behavior, Roth IRMAA Cap, Medicare IRMAA Tier Ceiling</w:t>
       </w:r>
     </w:p>
     <w:p>
@@ -6482,7 +6758,7 @@
         <w:rPr>
           <w:sz w:val="18"/>
         </w:rPr>
-        <w:t>Economic &amp; Tax Assumptions | state tax rate</w:t>
+        <w:t>Economic &amp; Tax Assumptions | State Tax Rate</w:t>
       </w:r>
     </w:p>
     <w:p>
@@ -6614,7 +6890,7 @@
         <w:rPr>
           <w:sz w:val="18"/>
         </w:rPr>
-        <w:t>Stress Test &gt; Monte Carlo | stochastic_tax_brackets, stochastic_irmaa</w:t>
+        <w:t>Stress Test &gt; Monte Carlo | Stochastic Tax Brackets, Stochastic IRMAA</w:t>
       </w:r>
     </w:p>
     <w:p>
@@ -6717,7 +6993,7 @@
         <w:rPr>
           <w:sz w:val="18"/>
         </w:rPr>
-        <w:t>Model Constants | member_1_rmd_start_age, member_2_rmd_start_age</w:t>
+        <w:t>Model Constants | [Name 1] RMD Start Age, [Name 2] RMD Start Age</w:t>
       </w:r>
     </w:p>
     <w:p>
@@ -6783,7 +7059,7 @@
         <w:rPr>
           <w:sz w:val="18"/>
         </w:rPr>
-        <w:t>Roth Conversion | roth_conversion_policy, roth_bracket_strategy</w:t>
+        <w:t>Roth Conversion | Roth Conversion Policy, Roth Bracket Strategy</w:t>
       </w:r>
     </w:p>
     <w:p>
@@ -6849,7 +7125,7 @@
         <w:rPr>
           <w:sz w:val="18"/>
         </w:rPr>
-        <w:t>Roth Conversion | roth_target_bracket_rate, roth_conversion_target_bracket_base_year, roth_headroom_usage_pct</w:t>
+        <w:t>Roth Conversion | Roth Tax-Bracket Ceiling, Roth Conversion Target Bracket Base Year, Roth Headroom Usage</w:t>
       </w:r>
     </w:p>
     <w:p>
@@ -6915,7 +7191,7 @@
         <w:rPr>
           <w:sz w:val="18"/>
         </w:rPr>
-        <w:t>Roth Conversion | max_annual_conversion_pct_of_traditional_ira, max_conversion_years, roth_conv_window_end_offset</w:t>
+        <w:t>Roth Conversion | Max Annual Conversion Of Traditional IRA, Max Conversion Years, Roth Conv Window End Offset</w:t>
       </w:r>
     </w:p>
     <w:p>
@@ -6981,7 +7257,7 @@
         <w:rPr>
           <w:sz w:val="18"/>
         </w:rPr>
-        <w:t>Roth Conversion | roth_phase_count, roth_phase_first/second/third_bracket_rate</w:t>
+        <w:t>Roth Conversion | Roth Phase Count, Roth Phase 1, 2 and 3 Bracket Rate</w:t>
       </w:r>
     </w:p>
     <w:p>
@@ -7047,7 +7323,7 @@
         <w:rPr>
           <w:sz w:val="18"/>
         </w:rPr>
-        <w:t>Roth Conversion | roth_objective_mode, roth_optimize_terminal_weight, roth_optimize_lifetime_tax_weight, future_tax_risk_weight, survivor_tax_risk_weight</w:t>
+        <w:t>Roth Conversion | Roth Objective Mode, Roth Optimize Terminal Weight, Roth Optimize Lifetime Tax Weight, Future Tax Risk Weight, Survivor Tax Risk Weight</w:t>
       </w:r>
     </w:p>
     <w:p>
@@ -7113,7 +7389,7 @@
         <w:rPr>
           <w:sz w:val="18"/>
         </w:rPr>
-        <w:t>Roth Conversion | pre_tax_bequest_penalty_pct, roth_bequest_preference_bonus_pct, heir_ordinary_tax_rate_assumption_pct</w:t>
+        <w:t>Roth Conversion | Pre Tax Bequest Penalty, Roth Bequest Preference Bonus, Heir Ordinary Tax Rate Assumption</w:t>
       </w:r>
     </w:p>
     <w:p>
@@ -7179,7 +7455,7 @@
         <w:rPr>
           <w:sz w:val="18"/>
         </w:rPr>
-        <w:t>Roth Conversion | roth_tax_discount_rate</w:t>
+        <w:t>Roth Conversion | Roth Tax Discount Rate</w:t>
       </w:r>
     </w:p>
     <w:p>
@@ -7245,7 +7521,7 @@
         <w:rPr>
           <w:sz w:val="18"/>
         </w:rPr>
-        <w:t>Education &amp; Equity Comp | allow_secure_2_roth_rollover</w:t>
+        <w:t>Education &amp; Equity Comp | Allow Secure 2 Roth Rollover</w:t>
       </w:r>
     </w:p>
     <w:p>
@@ -7311,7 +7587,7 @@
         <w:rPr>
           <w:sz w:val="18"/>
         </w:rPr>
-        <w:t>Optimize &gt; Withdrawal Sequencing | decedent_balances_pass_to_survivor</w:t>
+        <w:t>Optimize &gt; Withdrawal Sequencing | Decedent Balances Pass To Survivor</w:t>
       </w:r>
     </w:p>
     <w:p>
@@ -7414,7 +7690,7 @@
         <w:rPr>
           <w:sz w:val="18"/>
         </w:rPr>
-        <w:t>Work Income / Charitable Giving | annual_charitable_giving_low, annual_charitable_giving_high</w:t>
+        <w:t>Work Income / Charitable Giving | Annual Charitable Giving Low, Annual Charitable Giving High</w:t>
       </w:r>
     </w:p>
     <w:p>
@@ -7480,7 +7756,7 @@
         <w:rPr>
           <w:sz w:val="18"/>
         </w:rPr>
-        <w:t>Charitable Giving | qcd_enabled, qcd annual amount, start/end year</w:t>
+        <w:t>Charitable Giving | QCD Enabled, QCD Annual Amount, Start Year and End Year</w:t>
       </w:r>
     </w:p>
     <w:p>
@@ -7546,7 +7822,7 @@
         <w:rPr>
           <w:sz w:val="18"/>
         </w:rPr>
-        <w:t>Charitable Giving | enabled, contribution_amount, contribution_year, annual_grant_amount, grant_start_year, grant_end_year</w:t>
+        <w:t>Charitable Giving | Enabled, Contribution Amount, Contribution Year, Annual Grant Amount, Grant Start Year, Grant End Year</w:t>
       </w:r>
     </w:p>
     <w:p>
@@ -7649,7 +7925,7 @@
         <w:rPr>
           <w:sz w:val="18"/>
         </w:rPr>
-        <w:t>Insurance | policy_type, face_amount, cash_value_today, annual_premium, term_end_year, owned_by_ilit</w:t>
+        <w:t>Insurance | Policy Type, Face Amount, Cash Value Today, Annual Premium, Term End Year, Owned By ILIT</w:t>
       </w:r>
     </w:p>
     <w:p>
@@ -7715,7 +7991,7 @@
         <w:rPr>
           <w:sz w:val="18"/>
         </w:rPr>
-        <w:t>Stress Test &gt; Long-Term Care | onset_age_*</w:t>
+        <w:t>Stress Test &gt; Long-Term Care | the Onset Age fields</w:t>
       </w:r>
     </w:p>
     <w:p>
@@ -7781,7 +8057,7 @@
         <w:rPr>
           <w:sz w:val="18"/>
         </w:rPr>
-        <w:t>Other Assets &gt; Hybrid LTC | face_value, annual_premium, start_year, insured</w:t>
+        <w:t>Other Assets &gt; Hybrid LTC | Face Value, Annual Premium, Start Year, Insured</w:t>
       </w:r>
     </w:p>
     <w:p>
@@ -7847,7 +8123,7 @@
         <w:rPr>
           <w:sz w:val="18"/>
         </w:rPr>
-        <w:t>Insurance | monthly_benefit, elimination_days, benefit_period_years, simulate_disability_year</w:t>
+        <w:t>Insurance | Monthly Benefit, Elimination Days, Benefit Period Years, Simulate Disability Year</w:t>
       </w:r>
     </w:p>
     <w:p>
@@ -7913,7 +8189,7 @@
         <w:rPr>
           <w:sz w:val="18"/>
         </w:rPr>
-        <w:t>Insurance | umbrella_target_multiple_of_nw, coverage_limit, deductible</w:t>
+        <w:t>Insurance | Umbrella Target Multiple Of Net Worth, Coverage Limit, Deductible</w:t>
       </w:r>
     </w:p>
     <w:p>
@@ -7979,7 +8255,7 @@
         <w:rPr>
           <w:sz w:val="18"/>
         </w:rPr>
-        <w:t>Education &amp; Equity Comp | grant_type, exercise_price, fmv_per_share_today, planned_exercise_year, planned_sale_year, fmv_growth_rate</w:t>
+        <w:t>Education &amp; Equity Comp | Grant Type, Exercise Price, FMV Per Share Today, Planned Exercise Year, Planned Sale Year, FMV Growth Rate</w:t>
       </w:r>
     </w:p>
     <w:p>
@@ -8045,7 +8321,7 @@
         <w:rPr>
           <w:sz w:val="18"/>
         </w:rPr>
-        <w:t>Education &amp; Equity Comp | balance_today, monthly_contribution, growth_rate, annual_cost_today, cost_inflation_rate, state_deduction_eligible</w:t>
+        <w:t>Education &amp; Equity Comp | Balance Today, Monthly Contribution, Growth Rate, Annual Cost Today, Cost Inflation Rate, State Deduction Eligible</w:t>
       </w:r>
     </w:p>
     <w:p>
@@ -8111,7 +8387,7 @@
         <w:rPr>
           <w:sz w:val="18"/>
         </w:rPr>
-        <w:t>Estate Inputs | valuation_today, valuation_growth_rate, ownership_pct, buy_sell_type, transfer_year</w:t>
+        <w:t>Estate Inputs | Valuation Today, Valuation Growth Rate, Ownership, Buy Sell Type, Transfer Year</w:t>
       </w:r>
     </w:p>
     <w:p>
@@ -8177,7 +8453,7 @@
         <w:rPr>
           <w:sz w:val="18"/>
         </w:rPr>
-        <w:t>Estate Inputs | annual_support_today, ssi_monthly, ssdi_monthly, medicaid_enrolled</w:t>
+        <w:t>Estate Inputs | Annual Support Today, SSI Monthly, SSDI Monthly, Medicaid Enrolled</w:t>
       </w:r>
     </w:p>
     <w:p>
@@ -8243,7 +8519,7 @@
         <w:rPr>
           <w:sz w:val="18"/>
         </w:rPr>
-        <w:t>Stress Test &gt; Divorce Planning | divorce_year, filing_status_after_divorce, transfer_pct, transfer_amount</w:t>
+        <w:t>Stress Test &gt; Divorce Planning | Divorce Year, Filing Status After Divorce, Transfer, Transfer Amount</w:t>
       </w:r>
     </w:p>
     <w:p>
@@ -8346,7 +8622,7 @@
         <w:rPr>
           <w:sz w:val="18"/>
         </w:rPr>
-        <w:t>Estate Inputs | exemption_mfj, state_estate_exemption, portability_enabled</w:t>
+        <w:t>Estate Inputs | Exemption MFJ, State Estate Exemption, Portability Enabled</w:t>
       </w:r>
     </w:p>
     <w:p>
@@ -8412,7 +8688,7 @@
         <w:rPr>
           <w:sz w:val="18"/>
         </w:rPr>
-        <w:t>Estate Inputs | trust_type, funding_amount</w:t>
+        <w:t>Estate Inputs | Trust Type, Funding Amount</w:t>
       </w:r>
     </w:p>
     <w:p>
@@ -8478,7 +8754,7 @@
         <w:rPr>
           <w:sz w:val="18"/>
         </w:rPr>
-        <w:t>Estate Inputs | basis_step_up_at_death</w:t>
+        <w:t>Estate Inputs | Basis Step Up At Death</w:t>
       </w:r>
     </w:p>
     <w:p>
@@ -8544,7 +8820,7 @@
         <w:rPr>
           <w:sz w:val="18"/>
         </w:rPr>
-        <w:t>Estate Inputs | annual_exclusion_per_donee</w:t>
+        <w:t>Estate Inputs | Annual Exclusion Per Donee</w:t>
       </w:r>
     </w:p>
     <w:p>
@@ -8610,7 +8886,7 @@
         <w:rPr>
           <w:sz w:val="18"/>
         </w:rPr>
-        <w:t>Estate Inputs | legacy_floor</w:t>
+        <w:t>Estate Inputs | Legacy Floor</w:t>
       </w:r>
     </w:p>
     <w:p>
@@ -8779,7 +9055,7 @@
         <w:rPr>
           <w:sz w:val="18"/>
         </w:rPr>
-        <w:t>Stress Test &gt; Monte Carlo | mc_simulations, mc_engine_mode, mc_portfolio_sigma, mc_sensitivity_simulations</w:t>
+        <w:t>Stress Test &gt; Monte Carlo | Monte Carlo Simulations, Monte Carlo Engine, Monte Carlo Portfolio Sigma, Monte Carlo Sensitivity Simulations</w:t>
       </w:r>
     </w:p>
     <w:p>
@@ -8845,7 +9121,7 @@
         <w:rPr>
           <w:sz w:val="18"/>
         </w:rPr>
-        <w:t>Stress Test &gt; Monte Carlo | mc_portfolio_sigma, inflation_sigma</w:t>
+        <w:t>Stress Test &gt; Monte Carlo | Monte Carlo Portfolio Sigma, Inflation Sigma</w:t>
       </w:r>
     </w:p>
     <w:p>
@@ -8911,7 +9187,7 @@
         <w:rPr>
           <w:sz w:val="18"/>
         </w:rPr>
-        <w:t>Stress Test &gt; Monte Carlo | success_liquid_floor</w:t>
+        <w:t>Stress Test &gt; Monte Carlo | Success Liquid Floor</w:t>
       </w:r>
     </w:p>
     <w:p>
@@ -8977,7 +9253,7 @@
         <w:rPr>
           <w:sz w:val="18"/>
         </w:rPr>
-        <w:t>Stress Test &gt; Monte Carlo | mc_home_equity_contingency, mc_home_equity_haircut, mc_home_equity_access_lag_years</w:t>
+        <w:t>Stress Test &gt; Monte Carlo | Monte Carlo Home Equity Contingency, Monte Carlo Home Equity Haircut, Monte Carlo Home Equity Access Lag Years</w:t>
       </w:r>
     </w:p>
     <w:p>
@@ -9043,7 +9319,7 @@
         <w:rPr>
           <w:sz w:val="18"/>
         </w:rPr>
-        <w:t>Stress Test &gt; Monte Carlo | return_inflation_correlation, return_serial_correlation, use_asset_class_covariance, stochastic_inflation</w:t>
+        <w:t>Stress Test &gt; Monte Carlo | Return Inflation Correlation, Return Serial Correlation, Use Asset Class Covariance, Stochastic Inflation</w:t>
       </w:r>
     </w:p>
     <w:p>
@@ -9608,7 +9884,7 @@
         <w:rPr>
           <w:sz w:val="18"/>
         </w:rPr>
-        <w:t>Scenarios | inflation_override, portfolio_return_override, salary_override, member_1_retire_year, include_*</w:t>
+        <w:t>Scenarios | Inflation Override, Portfolio Return Override, Salary Override, [Name 1] Retire Year, the Include fields</w:t>
       </w:r>
     </w:p>
     <w:p>
@@ -9674,7 +9950,7 @@
         <w:rPr>
           <w:sz w:val="18"/>
         </w:rPr>
-        <w:t>Plan Features | Optional Functions, plan_tier</w:t>
+        <w:t>Plan Features | Optional Functions, Plan Tier</w:t>
       </w:r>
     </w:p>
     <w:p>

</xml_diff>